<commit_message>
Dashboard TPC: opção combinada Supply + Confiance no filtro
- Filtro D3 do Dashboard ganha 'Supply + Confiance' (soma fluxos e estoques dos dois)
- Supply e Confiance seguem como opções separadas; BD, Monitoramento e Consol Mensal sem mudança
- Perfil dos cards/gráficos do grupo segue o do Supply
- Modelos vazios e manual TPC atualizados

Co-Authored-By: Claude Opus 5.5 <noreply@anthropic.com>
Claude-Session: https://claude.ai/code/session_018R75zNjSBiJnTTDUgbhCDy
</commit_message>
<xml_diff>
--- a/Manual_Planilha_TPC.docx
+++ b/Manual_Planilha_TPC.docx
@@ -2522,6 +2522,30 @@
           <w:b/>
           <w:bCs/>
         </w:rPr>
+        <w:t xml:space="preserve">Supply + Confiance (D3):</w:t>
+      </w:r>
+      <w:r>
+        <w:rPr>
+          <w:rFonts w:ascii="Calibri" w:cs="Calibri" w:eastAsia="Calibri" w:hAnsi="Calibri"/>
+        </w:rPr>
+        <w:t xml:space="preserve"> opção combinada logo abaixo de Todos. Cards e gráficos somam os dois clientes (fluxos somados no período; estoques como efetivo e ocupação somados no último dia). Supply e Confiance continuam também como opções separadas. Só o Dashboard tem essa opção — BD, Monitoramento e Consol Mensal seguem por cliente.</w:t>
+      </w:r>
+    </w:p>
+    <w:p>
+      <w:pPr>
+        <w:pStyle w:val="ListParagraph"/>
+        <w:numPr>
+          <w:ilvl w:val="0"/>
+          <w:numId w:val="2"/>
+        </w:numPr>
+        <w:spacing w:after="60"/>
+      </w:pPr>
+      <w:r>
+        <w:rPr>
+          <w:rFonts w:ascii="Calibri" w:cs="Calibri" w:eastAsia="Calibri" w:hAnsi="Calibri"/>
+          <w:b/>
+          <w:bCs/>
+        </w:rPr>
         <w:t xml:space="preserve">Período (Q3 e V3):</w:t>
       </w:r>
       <w:r>
@@ -8078,7 +8102,7 @@
               <w:rPr>
                 <w:rFonts w:ascii="Calibri" w:cs="Calibri" w:eastAsia="Calibri" w:hAnsi="Calibri"/>
               </w:rPr>
-              <w:t xml:space="preserve">Cliente não aparece no filtro</w:t>
+              <w:t xml:space="preserve">Supply + Confiance não soma um dos dois</w:t>
             </w:r>
           </w:p>
         </w:tc>
@@ -8101,7 +8125,7 @@
               <w:rPr>
                 <w:rFonts w:ascii="Calibri" w:cs="Calibri" w:eastAsia="Calibri" w:hAnsi="Calibri"/>
               </w:rPr>
-              <w:t xml:space="preserve">Não está cadastrado na Config › tabela 1.</w:t>
+              <w:t xml:space="preserve">O nome do cliente na Config/BD foi alterado (o grupo procura "Supply" e "Confiance").</w:t>
             </w:r>
           </w:p>
         </w:tc>
@@ -8124,7 +8148,7 @@
               <w:rPr>
                 <w:rFonts w:ascii="Calibri" w:cs="Calibri" w:eastAsia="Calibri" w:hAnsi="Calibri"/>
               </w:rPr>
-              <w:t xml:space="preserve">Cadastrar o nome numa vaga livre.</w:t>
+              <w:t xml:space="preserve">Manter os nomes Supply e Confiance na Config e na BD.</w:t>
             </w:r>
           </w:p>
         </w:tc>
@@ -8152,7 +8176,7 @@
               <w:rPr>
                 <w:rFonts w:ascii="Calibri" w:cs="Calibri" w:eastAsia="Calibri" w:hAnsi="Calibri"/>
               </w:rPr>
-              <w:t xml:space="preserve">Monitoramento do cliente vazio</w:t>
+              <w:t xml:space="preserve">Cliente não aparece no filtro</w:t>
             </w:r>
           </w:p>
         </w:tc>
@@ -8175,7 +8199,7 @@
               <w:rPr>
                 <w:rFonts w:ascii="Calibri" w:cs="Calibri" w:eastAsia="Calibri" w:hAnsi="Calibri"/>
               </w:rPr>
-              <w:t xml:space="preserve">Nome do bloco diferente do nome na BD (acento, espaço).</w:t>
+              <w:t xml:space="preserve">Não está cadastrado na Config › tabela 1.</w:t>
             </w:r>
           </w:p>
         </w:tc>
@@ -8198,7 +8222,7 @@
               <w:rPr>
                 <w:rFonts w:ascii="Calibri" w:cs="Calibri" w:eastAsia="Calibri" w:hAnsi="Calibri"/>
               </w:rPr>
-              <w:t xml:space="preserve">Igualar o nome na coluna CLIENTE do bloco.</w:t>
+              <w:t xml:space="preserve">Cadastrar o nome numa vaga livre.</w:t>
             </w:r>
           </w:p>
         </w:tc>
@@ -8226,7 +8250,7 @@
               <w:rPr>
                 <w:rFonts w:ascii="Calibri" w:cs="Calibri" w:eastAsia="Calibri" w:hAnsi="Calibri"/>
               </w:rPr>
-              <w:t xml:space="preserve">Não consigo digitar numa coluna da BD</w:t>
+              <w:t xml:space="preserve">Monitoramento do cliente vazio</w:t>
             </w:r>
           </w:p>
         </w:tc>
@@ -8249,7 +8273,7 @@
               <w:rPr>
                 <w:rFonts w:ascii="Calibri" w:cs="Calibri" w:eastAsia="Calibri" w:hAnsi="Calibri"/>
               </w:rPr>
-              <w:t xml:space="preserve">Coluna marcada "Não" para o cliente (Config › tabela 2) ou valor negativo.</w:t>
+              <w:t xml:space="preserve">Nome do bloco diferente do nome na BD (acento, espaço).</w:t>
             </w:r>
           </w:p>
         </w:tc>
@@ -8272,7 +8296,7 @@
               <w:rPr>
                 <w:rFonts w:ascii="Calibri" w:cs="Calibri" w:eastAsia="Calibri" w:hAnsi="Calibri"/>
               </w:rPr>
-              <w:t xml:space="preserve">Liberar em Config › tabela 2 ou corrigir o valor.</w:t>
+              <w:t xml:space="preserve">Igualar o nome na coluna CLIENTE do bloco.</w:t>
             </w:r>
           </w:p>
         </w:tc>
@@ -8300,7 +8324,7 @@
               <w:rPr>
                 <w:rFonts w:ascii="Calibri" w:cs="Calibri" w:eastAsia="Calibri" w:hAnsi="Calibri"/>
               </w:rPr>
-              <w:t xml:space="preserve">Card mostra "não se aplica"</w:t>
+              <w:t xml:space="preserve">Não consigo digitar numa coluna da BD</w:t>
             </w:r>
           </w:p>
         </w:tc>
@@ -8323,7 +8347,7 @@
               <w:rPr>
                 <w:rFonts w:ascii="Calibri" w:cs="Calibri" w:eastAsia="Calibri" w:hAnsi="Calibri"/>
               </w:rPr>
-              <w:t xml:space="preserve">Config › tabela 1: CARD IN/OUT = Não se aplica.</w:t>
+              <w:t xml:space="preserve">Coluna marcada "Não" para o cliente (Config › tabela 2) ou valor negativo.</w:t>
             </w:r>
           </w:p>
         </w:tc>
@@ -8346,7 +8370,7 @@
               <w:rPr>
                 <w:rFonts w:ascii="Calibri" w:cs="Calibri" w:eastAsia="Calibri" w:hAnsi="Calibri"/>
               </w:rPr>
-              <w:t xml:space="preserve">Mudar para Sim, se o cliente passou a ter o fluxo.</w:t>
+              <w:t xml:space="preserve">Liberar em Config › tabela 2 ou corrigir o valor.</w:t>
             </w:r>
           </w:p>
         </w:tc>
@@ -8374,7 +8398,7 @@
               <w:rPr>
                 <w:rFonts w:ascii="Calibri" w:cs="Calibri" w:eastAsia="Calibri" w:hAnsi="Calibri"/>
               </w:rPr>
-              <w:t xml:space="preserve">Gráfico 2 ou 3 vazio</w:t>
+              <w:t xml:space="preserve">Card mostra "não se aplica"</w:t>
             </w:r>
           </w:p>
         </w:tc>
@@ -8397,7 +8421,7 @@
               <w:rPr>
                 <w:rFonts w:ascii="Calibri" w:cs="Calibri" w:eastAsia="Calibri" w:hAnsi="Calibri"/>
               </w:rPr>
-              <w:t xml:space="preserve">Indicador do gráfico sem lançamentos no mês, ou vazio na Config.</w:t>
+              <w:t xml:space="preserve">Config › tabela 1: CARD IN/OUT = Não se aplica.</w:t>
             </w:r>
           </w:p>
         </w:tc>
@@ -8420,7 +8444,7 @@
               <w:rPr>
                 <w:rFonts w:ascii="Calibri" w:cs="Calibri" w:eastAsia="Calibri" w:hAnsi="Calibri"/>
               </w:rPr>
-              <w:t xml:space="preserve">Conferir a BD e Config › tabela 1.</w:t>
+              <w:t xml:space="preserve">Mudar para Sim, se o cliente passou a ter o fluxo.</w:t>
             </w:r>
           </w:p>
         </w:tc>
@@ -8448,7 +8472,7 @@
               <w:rPr>
                 <w:rFonts w:ascii="Calibri" w:cs="Calibri" w:eastAsia="Calibri" w:hAnsi="Calibri"/>
               </w:rPr>
-              <w:t xml:space="preserve">Consol Mensal mostra "—"</w:t>
+              <w:t xml:space="preserve">Gráfico 2 ou 3 vazio</w:t>
             </w:r>
           </w:p>
         </w:tc>
@@ -8471,7 +8495,7 @@
               <w:rPr>
                 <w:rFonts w:ascii="Calibri" w:cs="Calibri" w:eastAsia="Calibri" w:hAnsi="Calibri"/>
               </w:rPr>
-              <w:t xml:space="preserve">Indicador marcado "Não" para o cliente.</w:t>
+              <w:t xml:space="preserve">Indicador do gráfico sem lançamentos no mês, ou vazio na Config.</w:t>
             </w:r>
           </w:p>
         </w:tc>
@@ -8494,7 +8518,7 @@
               <w:rPr>
                 <w:rFonts w:ascii="Calibri" w:cs="Calibri" w:eastAsia="Calibri" w:hAnsi="Calibri"/>
               </w:rPr>
-              <w:t xml:space="preserve">Esperado; ajustar a tabela 2 se estiver errado.</w:t>
+              <w:t xml:space="preserve">Conferir a BD e Config › tabela 1.</w:t>
             </w:r>
           </w:p>
         </w:tc>
@@ -8522,7 +8546,7 @@
               <w:rPr>
                 <w:rFonts w:ascii="Calibri" w:cs="Calibri" w:eastAsia="Calibri" w:hAnsi="Calibri"/>
               </w:rPr>
-              <w:t xml:space="preserve">Taxa de ocupação vazia ou contratada 0</w:t>
+              <w:t xml:space="preserve">Consol Mensal mostra "—"</w:t>
             </w:r>
           </w:p>
         </w:tc>
@@ -8545,7 +8569,7 @@
               <w:rPr>
                 <w:rFonts w:ascii="Calibri" w:cs="Calibri" w:eastAsia="Calibri" w:hAnsi="Calibri"/>
               </w:rPr>
-              <w:t xml:space="preserve">MODALIDADE ou POSIÇÕES CONTRATADAS do cliente não preenchidas na Config.</w:t>
+              <w:t xml:space="preserve">Indicador marcado "Não" para o cliente.</w:t>
             </w:r>
           </w:p>
         </w:tc>
@@ -8568,7 +8592,7 @@
               <w:rPr>
                 <w:rFonts w:ascii="Calibri" w:cs="Calibri" w:eastAsia="Calibri" w:hAnsi="Calibri"/>
               </w:rPr>
-              <w:t xml:space="preserve">Preencher na Config › tabela 1.</w:t>
+              <w:t xml:space="preserve">Esperado; ajustar a tabela 2 se estiver errado.</w:t>
             </w:r>
           </w:p>
         </w:tc>
@@ -8596,7 +8620,7 @@
               <w:rPr>
                 <w:rFonts w:ascii="Calibri" w:cs="Calibri" w:eastAsia="Calibri" w:hAnsi="Calibri"/>
               </w:rPr>
-              <w:t xml:space="preserve">Meta não aparece</w:t>
+              <w:t xml:space="preserve">Taxa de ocupação vazia ou contratada 0</w:t>
             </w:r>
           </w:p>
         </w:tc>
@@ -8619,7 +8643,7 @@
               <w:rPr>
                 <w:rFonts w:ascii="Calibri" w:cs="Calibri" w:eastAsia="Calibri" w:hAnsi="Calibri"/>
               </w:rPr>
-              <w:t xml:space="preserve">Coluna da meta vazia, ou cabeçalho ainda "Vaga N" / nome diferente do cadastro.</w:t>
+              <w:t xml:space="preserve">MODALIDADE ou POSIÇÕES CONTRATADAS do cliente não preenchidas na Config.</w:t>
             </w:r>
           </w:p>
         </w:tc>
@@ -8642,7 +8666,7 @@
               <w:rPr>
                 <w:rFonts w:ascii="Calibri" w:cs="Calibri" w:eastAsia="Calibri" w:hAnsi="Calibri"/>
               </w:rPr>
-              <w:t xml:space="preserve">Renomear o cabeçalho e preencher a meta.</w:t>
+              <w:t xml:space="preserve">Preencher na Config › tabela 1.</w:t>
             </w:r>
           </w:p>
         </w:tc>
@@ -8670,7 +8694,7 @@
               <w:rPr>
                 <w:rFonts w:ascii="Calibri" w:cs="Calibri" w:eastAsia="Calibri" w:hAnsi="Calibri"/>
               </w:rPr>
-              <w:t xml:space="preserve">Acabaram as vagas</w:t>
+              <w:t xml:space="preserve">Meta não aparece</w:t>
             </w:r>
           </w:p>
         </w:tc>
@@ -8693,7 +8717,7 @@
               <w:rPr>
                 <w:rFonts w:ascii="Calibri" w:cs="Calibri" w:eastAsia="Calibri" w:hAnsi="Calibri"/>
               </w:rPr>
-              <w:t xml:space="preserve">20 clientes cadastrados.</w:t>
+              <w:t xml:space="preserve">Coluna da meta vazia, ou cabeçalho ainda "Vaga N" / nome diferente do cadastro.</w:t>
             </w:r>
           </w:p>
         </w:tc>
@@ -8716,7 +8740,7 @@
               <w:rPr>
                 <w:rFonts w:ascii="Calibri" w:cs="Calibri" w:eastAsia="Calibri" w:hAnsi="Calibri"/>
               </w:rPr>
-              <w:t xml:space="preserve">Reutilizar a vaga de um cliente que saiu.</w:t>
+              <w:t xml:space="preserve">Renomear o cabeçalho e preencher a meta.</w:t>
             </w:r>
           </w:p>
         </w:tc>
@@ -8744,7 +8768,7 @@
               <w:rPr>
                 <w:rFonts w:ascii="Calibri" w:cs="Calibri" w:eastAsia="Calibri" w:hAnsi="Calibri"/>
               </w:rPr>
-              <w:t xml:space="preserve">Esqueci a senha</w:t>
+              <w:t xml:space="preserve">Acabaram as vagas</w:t>
             </w:r>
           </w:p>
         </w:tc>
@@ -8767,7 +8791,7 @@
               <w:rPr>
                 <w:rFonts w:ascii="Calibri" w:cs="Calibri" w:eastAsia="Calibri" w:hAnsi="Calibri"/>
               </w:rPr>
-              <w:t xml:space="preserve">—</w:t>
+              <w:t xml:space="preserve">20 clientes cadastrados.</w:t>
             </w:r>
           </w:p>
         </w:tc>
@@ -8775,6 +8799,80 @@
           <w:tcPr>
             <w:tcW w:type="dxa" w:w="3000"/>
             <w:shd w:fill="F2F2F2" w:color="auto" w:val="clear"/>
+            <w:tcMar>
+              <w:top w:type="dxa" w:w="60"/>
+              <w:left w:type="dxa" w:w="100"/>
+              <w:bottom w:type="dxa" w:w="60"/>
+              <w:right w:type="dxa" w:w="100"/>
+            </w:tcMar>
+          </w:tcPr>
+          <w:p>
+            <w:pPr>
+              <w:spacing w:after="0"/>
+            </w:pPr>
+            <w:r>
+              <w:rPr>
+                <w:rFonts w:ascii="Calibri" w:cs="Calibri" w:eastAsia="Calibri" w:hAnsi="Calibri"/>
+              </w:rPr>
+              <w:t xml:space="preserve">Reutilizar a vaga de um cliente que saiu.</w:t>
+            </w:r>
+          </w:p>
+        </w:tc>
+      </w:tr>
+      <w:tr>
+        <w:trPr>
+          <w:cantSplit/>
+        </w:trPr>
+        <w:tc>
+          <w:tcPr>
+            <w:tcW w:type="dxa" w:w="2700"/>
+            <w:shd w:fill="FFFFFF" w:color="auto" w:val="clear"/>
+            <w:tcMar>
+              <w:top w:type="dxa" w:w="60"/>
+              <w:left w:type="dxa" w:w="100"/>
+              <w:bottom w:type="dxa" w:w="60"/>
+              <w:right w:type="dxa" w:w="100"/>
+            </w:tcMar>
+          </w:tcPr>
+          <w:p>
+            <w:pPr>
+              <w:spacing w:after="0"/>
+            </w:pPr>
+            <w:r>
+              <w:rPr>
+                <w:rFonts w:ascii="Calibri" w:cs="Calibri" w:eastAsia="Calibri" w:hAnsi="Calibri"/>
+              </w:rPr>
+              <w:t xml:space="preserve">Esqueci a senha</w:t>
+            </w:r>
+          </w:p>
+        </w:tc>
+        <w:tc>
+          <w:tcPr>
+            <w:tcW w:type="dxa" w:w="3326"/>
+            <w:shd w:fill="FFFFFF" w:color="auto" w:val="clear"/>
+            <w:tcMar>
+              <w:top w:type="dxa" w:w="60"/>
+              <w:left w:type="dxa" w:w="100"/>
+              <w:bottom w:type="dxa" w:w="60"/>
+              <w:right w:type="dxa" w:w="100"/>
+            </w:tcMar>
+          </w:tcPr>
+          <w:p>
+            <w:pPr>
+              <w:spacing w:after="0"/>
+            </w:pPr>
+            <w:r>
+              <w:rPr>
+                <w:rFonts w:ascii="Calibri" w:cs="Calibri" w:eastAsia="Calibri" w:hAnsi="Calibri"/>
+              </w:rPr>
+              <w:t xml:space="preserve">—</w:t>
+            </w:r>
+          </w:p>
+        </w:tc>
+        <w:tc>
+          <w:tcPr>
+            <w:tcW w:type="dxa" w:w="3000"/>
+            <w:shd w:fill="FFFFFF" w:color="auto" w:val="clear"/>
             <w:tcMar>
               <w:top w:type="dxa" w:w="60"/>
               <w:left w:type="dxa" w:w="100"/>

</xml_diff>